<commit_message>
Add clay emotion-face activity to 6/15 one-on-one lesson card
</commit_message>
<xml_diff>
--- a/0615一對一教學流程卡.docx
+++ b/0615一對一教學流程卡.docx
@@ -205,7 +205,7 @@
                 <w:b w:val="0"/>
                 <w:sz w:val="20"/>
               </w:rPr>
-              <w:t>拿出兩樣材料，讓他選今天先做哪一個：搖搖樂奶昔 或 捏捏球。</w:t>
+              <w:t>拿出材料，讓他選今天做哪些：搖搖樂奶昔、捏捏球、黏土情緒臉（做2樣就好，時間到為準）。</w:t>
             </w:r>
           </w:p>
           <w:p>
@@ -231,7 +231,7 @@
                 <w:b w:val="0"/>
                 <w:sz w:val="20"/>
               </w:rPr>
-              <w:t>「今天我們一起做兩個好玩的～你想先做『搖搖樂』還是『捏捏球』？你決定！」</w:t>
+              <w:t>「今天有三個好玩的～搖搖樂🥤、捏捏球🎈、黏土🎨，你想先做哪一個？你決定！」</w:t>
             </w:r>
           </w:p>
         </w:tc>
@@ -442,6 +442,117 @@
                 <w:b/>
                 <w:sz w:val="20"/>
               </w:rPr>
+              <w:t>③＋ 主活動C</w:t>
+            </w:r>
+          </w:p>
+          <w:p>
+            <w:r>
+              <w:rPr>
+                <w:rFonts w:ascii="Microsoft JhengHei" w:hAnsi="Microsoft JhengHei" w:eastAsia="Microsoft JhengHei"/>
+                <w:b/>
+                <w:sz w:val="20"/>
+              </w:rPr>
+              <w:t>黏土情緒臉</w:t>
+            </w:r>
+          </w:p>
+          <w:p>
+            <w:r>
+              <w:rPr>
+                <w:rFonts w:ascii="Microsoft JhengHei" w:hAnsi="Microsoft JhengHei" w:eastAsia="Microsoft JhengHei"/>
+                <w:b/>
+                <w:sz w:val="20"/>
+              </w:rPr>
+              <w:t>（三選一備案）約15分</w:t>
+            </w:r>
+          </w:p>
+        </w:tc>
+        <w:tc>
+          <w:tcPr>
+            <w:tcW w:type="dxa" w:w="3888"/>
+          </w:tcPr>
+          <w:p>
+            <w:r/>
+            <w:r>
+              <w:rPr>
+                <w:rFonts w:ascii="Microsoft JhengHei" w:hAnsi="Microsoft JhengHei" w:eastAsia="Microsoft JhengHei"/>
+                <w:b w:val="0"/>
+                <w:sz w:val="20"/>
+              </w:rPr>
+              <w:t>材料：超輕黏土（紅黃綠三色，文具王購入，挑無毒、軟的）。</w:t>
+            </w:r>
+          </w:p>
+          <w:p>
+            <w:r>
+              <w:rPr>
+                <w:rFonts w:ascii="Microsoft JhengHei" w:hAnsi="Microsoft JhengHei" w:eastAsia="Microsoft JhengHei"/>
+                <w:b w:val="0"/>
+                <w:sz w:val="20"/>
+              </w:rPr>
+              <w:t>玩法：① 捏一個「今天的心情」表情臉 ② 紅黃綠各搓一顆球，請他指「現在身體是哪一顆」（不用說話也能表達）。</w:t>
+            </w:r>
+          </w:p>
+          <w:p>
+            <w:r>
+              <w:rPr>
+                <w:rFonts w:ascii="Microsoft JhengHei" w:hAnsi="Microsoft JhengHei" w:eastAsia="Microsoft JhengHei"/>
+                <w:b w:val="0"/>
+                <w:sz w:val="20"/>
+              </w:rPr>
+              <w:t>（捏、壓、搓＝大動作，省力療癒）</w:t>
+            </w:r>
+          </w:p>
+        </w:tc>
+        <w:tc>
+          <w:tcPr>
+            <w:tcW w:type="dxa" w:w="3888"/>
+          </w:tcPr>
+          <w:p>
+            <w:r/>
+            <w:r>
+              <w:rPr>
+                <w:rFonts w:ascii="Microsoft JhengHei" w:hAnsi="Microsoft JhengHei" w:eastAsia="Microsoft JhengHei"/>
+                <w:b w:val="0"/>
+                <w:sz w:val="20"/>
+              </w:rPr>
+              <w:t>「我們來捏一個『今天的你』～開心、累累的、還是悶悶的都可以。」</w:t>
+            </w:r>
+          </w:p>
+          <w:p>
+            <w:r>
+              <w:rPr>
+                <w:rFonts w:ascii="Microsoft JhengHei" w:hAnsi="Microsoft JhengHei" w:eastAsia="Microsoft JhengHei"/>
+                <w:b w:val="0"/>
+                <w:sz w:val="20"/>
+              </w:rPr>
+              <w:t>「這三顆是紅綠燈～你現在的身體是哪一顆？指給老師看。」</w:t>
+            </w:r>
+          </w:p>
+          <w:p>
+            <w:r>
+              <w:rPr>
+                <w:rFonts w:ascii="Microsoft JhengHei" w:hAnsi="Microsoft JhengHei" w:eastAsia="Microsoft JhengHei"/>
+                <w:b w:val="0"/>
+                <w:sz w:val="20"/>
+              </w:rPr>
+              <w:t>「不舒服的時候，捏一捏，慢慢深呼吸。」</w:t>
+            </w:r>
+          </w:p>
+        </w:tc>
+      </w:tr>
+      <w:tr>
+        <w:tc>
+          <w:tcPr>
+            <w:tcW w:type="dxa" w:w="2016"/>
+            <w:shd w:val="clear" w:color="auto" w:fill="E8F5E9"/>
+          </w:tcPr>
+          <w:p>
+            <w:r/>
+            <w:r>
+              <w:rPr>
+                <w:rFonts w:ascii="Microsoft JhengHei" w:hAnsi="Microsoft JhengHei" w:eastAsia="Microsoft JhengHei"/>
+                <w:b/>
+                <w:sz w:val="20"/>
+              </w:rPr>
               <w:t>④ 收尾・連結主題</w:t>
             </w:r>
           </w:p>
@@ -528,7 +639,20 @@
           <w:b w:val="0"/>
           <w:sz w:val="22"/>
         </w:rPr>
-        <w:t>捏捏球：氣球、麵粉或米、漏斗（家裡有就好）</w:t>
+        <w:t>捏捏球：氣球、麵粉或米、漏斗（氣球、漏斗 → 十元商店／文具店）</w:t>
+      </w:r>
+    </w:p>
+    <w:p>
+      <w:pPr>
+        <w:spacing w:after="120"/>
+      </w:pPr>
+      <w:r>
+        <w:rPr>
+          <w:rFonts w:ascii="Microsoft JhengHei" w:hAnsi="Microsoft JhengHei" w:eastAsia="Microsoft JhengHei"/>
+          <w:b w:val="0"/>
+          <w:sz w:val="22"/>
+        </w:rPr>
+        <w:t>黏土：超輕黏土 紅・黃・綠 三色（文具王，挑無毒、軟的；避免太硬的油黏土）</w:t>
       </w:r>
     </w:p>
     <w:p>

</xml_diff>